<commit_message>
Deploying to gh-pages from @ Morrison-Lab/psw@73f994c5d1f16d83c75d1678ba7d7f91b2219ad4 🚀
</commit_message>
<xml_diff>
--- a/chapters/slides-posters-figures.docx
+++ b/chapters/slides-posters-figures.docx
@@ -15,7 +15,7 @@
         <w:pStyle w:val="Date"/>
       </w:pPr>
       <w:r>
-        <w:t xml:space="preserve">Last modified: 2026-10-13 17:55:03 (PDT)</w:t>
+        <w:t xml:space="preserve">Last modified: 2026-10-13 21:04:16 (PDT)</w:t>
       </w:r>
     </w:p>
     <w:p>
@@ -459,6 +459,45 @@
       </w:pPr>
       <w:r>
         <w:t xml:space="preserve">Include enough tick marks and tick labels.</w:t>
+      </w:r>
+    </w:p>
+    <w:p>
+      <w:pPr>
+        <w:pStyle w:val="Compact"/>
+        <w:numPr>
+          <w:ilvl w:val="0"/>
+          <w:numId w:val="1003"/>
+        </w:numPr>
+      </w:pPr>
+      <w:r>
+        <w:t xml:space="preserve">Print tick labels as plain or comma-separated numbers, such as 0.001 or 10,000, not in scientific notation.</w:t>
+      </w:r>
+      <w:r>
+        <w:t xml:space="preserve"> </w:t>
+      </w:r>
+      <w:r>
+        <w:t xml:space="preserve">A logarithmic axis is fine.</w:t>
+      </w:r>
+      <w:r>
+        <w:t xml:space="preserve"> </w:t>
+      </w:r>
+      <w:r>
+        <w:t xml:space="preserve">Only the label format matters, so write 1, 10, 100 and 1,000, not 1e+00 through 1e+03.</w:t>
+      </w:r>
+      <w:r>
+        <w:t xml:space="preserve"> </w:t>
+      </w:r>
+      <w:r>
+        <w:t xml:space="preserve">When the numbers are huge or tiny, rescale the units and say so in the axis title, such as</w:t>
+      </w:r>
+      <w:r>
+        <w:t xml:space="preserve"> </w:t>
+      </w:r>
+      <w:r>
+        <w:t xml:space="preserve">“dollars (millions)”</w:t>
+      </w:r>
+      <w:r>
+        <w:t xml:space="preserve">.</w:t>
       </w:r>
     </w:p>
     <w:p>

</xml_diff>

<commit_message>
Deploying to gh-pages from @ Morrison-Lab/psw@29c603c6205d2a4d4945c5ad7feade3ef64ab86f 🚀
</commit_message>
<xml_diff>
--- a/chapters/slides-posters-figures.docx
+++ b/chapters/slides-posters-figures.docx
@@ -15,7 +15,7 @@
         <w:pStyle w:val="Date"/>
       </w:pPr>
       <w:r>
-        <w:t xml:space="preserve">Last modified: 2026-10-14 02:26:37 (PDT)</w:t>
+        <w:t xml:space="preserve">Last modified: 2026-10-14 03:04:15 (PDT)</w:t>
       </w:r>
     </w:p>
     <w:p>
@@ -402,7 +402,7 @@
       </w:r>
     </w:p>
     <w:bookmarkEnd w:id="12"/>
-    <w:bookmarkStart w:id="29" w:name="sec-scientific-figures"/>
+    <w:bookmarkStart w:id="16" w:name="sec-scientific-figures"/>
     <w:p>
       <w:pPr>
         <w:pStyle w:val="Heading2"/>
@@ -668,6 +668,193 @@
       </w:r>
       <w:r>
         <w:t xml:space="preserve">with sidenotes, typography, and tight integration of graphics with text</w:t>
+      </w:r>
+    </w:p>
+    <w:bookmarkEnd w:id="16"/>
+    <w:bookmarkStart w:id="32" w:name="sec-3d-graphs"/>
+    <w:p>
+      <w:pPr>
+        <w:pStyle w:val="Heading2"/>
+      </w:pPr>
+      <w:r>
+        <w:t xml:space="preserve">4 Three-dimensional graphs</w:t>
+      </w:r>
+    </w:p>
+    <w:p>
+      <w:pPr>
+        <w:pStyle w:val="FirstParagraph"/>
+      </w:pPr>
+      <w:r>
+        <w:t xml:space="preserve">A function of two variables, such as a loss or a residual sum of squares</w:t>
+      </w:r>
+      <w:r>
+        <w:t xml:space="preserve"> </w:t>
+      </w:r>
+      <w:r>
+        <w:t xml:space="preserve">as a function of a regression’s intercept and slope,</w:t>
+      </w:r>
+      <w:r>
+        <w:t xml:space="preserve"> </w:t>
+      </w:r>
+      <w:r>
+        <w:t xml:space="preserve">is a surface.</w:t>
+      </w:r>
+      <w:r>
+        <w:t xml:space="preserve"> </w:t>
+      </w:r>
+      <w:r>
+        <w:t xml:space="preserve">A contour plot shows where the function takes given values and is easy to read values from.</w:t>
+      </w:r>
+      <w:r>
+        <w:t xml:space="preserve"> </w:t>
+      </w:r>
+      <w:r>
+        <w:t xml:space="preserve">A three-dimensional surface plot shows the same function as a landscape,</w:t>
+      </w:r>
+      <w:r>
+        <w:t xml:space="preserve"> </w:t>
+      </w:r>
+      <w:r>
+        <w:t xml:space="preserve">so valleys, ridges and minima are visible at once.</w:t>
+      </w:r>
+      <w:r>
+        <w:t xml:space="preserve"> </w:t>
+      </w:r>
+      <w:r>
+        <w:t xml:space="preserve">Show both when the shape of the surface matters.</w:t>
+      </w:r>
+    </w:p>
+    <w:p>
+      <w:pPr>
+        <w:pStyle w:val="Compact"/>
+        <w:numPr>
+          <w:ilvl w:val="0"/>
+          <w:numId w:val="1005"/>
+        </w:numPr>
+      </w:pPr>
+      <w:r>
+        <w:t xml:space="preserve">Use a 3D plot for a surface, with the function’s value on the vertical axis,</w:t>
+      </w:r>
+      <w:r>
+        <w:t xml:space="preserve"> </w:t>
+      </w:r>
+      <w:r>
+        <w:t xml:space="preserve">and pair it with a contour plot of the same function.</w:t>
+      </w:r>
+    </w:p>
+    <w:p>
+      <w:pPr>
+        <w:pStyle w:val="Compact"/>
+        <w:numPr>
+          <w:ilvl w:val="0"/>
+          <w:numId w:val="1005"/>
+        </w:numPr>
+      </w:pPr>
+      <w:r>
+        <w:t xml:space="preserve">Do not use 3D for data that are not a surface, such as bars or pie charts:</w:t>
+      </w:r>
+      <w:r>
+        <w:t xml:space="preserve"> </w:t>
+      </w:r>
+      <w:r>
+        <w:t xml:space="preserve">perspective makes lengths and areas harder to compare.</w:t>
+      </w:r>
+    </w:p>
+    <w:p>
+      <w:pPr>
+        <w:pStyle w:val="Compact"/>
+        <w:numPr>
+          <w:ilvl w:val="0"/>
+          <w:numId w:val="1005"/>
+        </w:numPr>
+      </w:pPr>
+      <w:r>
+        <w:t xml:space="preserve">Choose the viewing angle so that the feature you discuss, such as the minimum, is not hidden,</w:t>
+      </w:r>
+      <w:r>
+        <w:t xml:space="preserve"> </w:t>
+      </w:r>
+      <w:r>
+        <w:t xml:space="preserve">and label all three axes.</w:t>
+      </w:r>
+    </w:p>
+    <w:p>
+      <w:pPr>
+        <w:pStyle w:val="Compact"/>
+        <w:numPr>
+          <w:ilvl w:val="0"/>
+          <w:numId w:val="1005"/>
+        </w:numPr>
+      </w:pPr>
+      <w:r>
+        <w:t xml:space="preserve">An interactive plot that readers can rotate, such as one made with</w:t>
+      </w:r>
+      <w:r>
+        <w:t xml:space="preserve"> </w:t>
+      </w:r>
+      <w:hyperlink r:id="rId17">
+        <w:r>
+          <w:rPr>
+            <w:rStyle w:val="Hyperlink"/>
+          </w:rPr>
+          <w:t xml:space="preserve">plotly</w:t>
+        </w:r>
+      </w:hyperlink>
+      <w:r>
+        <w:t xml:space="preserve">, helps on the web,</w:t>
+      </w:r>
+      <w:r>
+        <w:t xml:space="preserve"> </w:t>
+      </w:r>
+      <w:r>
+        <w:t xml:space="preserve">but PDF and Word output show no interactive plot,</w:t>
+      </w:r>
+      <w:r>
+        <w:t xml:space="preserve"> </w:t>
+      </w:r>
+      <w:r>
+        <w:t xml:space="preserve">so also provide a static view at a fixed angle</w:t>
+      </w:r>
+      <w:r>
+        <w:t xml:space="preserve"> </w:t>
+      </w:r>
+      <w:r>
+        <w:t xml:space="preserve">(see</w:t>
+      </w:r>
+      <w:r>
+        <w:t xml:space="preserve"> </w:t>
+      </w:r>
+      <w:hyperlink r:id="rId18">
+        <w:r>
+          <w:rPr>
+            <w:rStyle w:val="Hyperlink"/>
+          </w:rPr>
+          <w:t xml:space="preserve">Make figures accessible</w:t>
+        </w:r>
+      </w:hyperlink>
+      <w:r>
+        <w:t xml:space="preserve">).</w:t>
+      </w:r>
+    </w:p>
+    <w:p>
+      <w:pPr>
+        <w:pStyle w:val="Compact"/>
+        <w:numPr>
+          <w:ilvl w:val="0"/>
+          <w:numId w:val="1005"/>
+        </w:numPr>
+      </w:pPr>
+      <w:r>
+        <w:t xml:space="preserve">Give a 3D plot alt text that states what the surface looks like, such as</w:t>
+      </w:r>
+      <w:r>
+        <w:t xml:space="preserve"> </w:t>
+      </w:r>
+      <w:r>
+        <w:t xml:space="preserve">“a bowl with its lowest point at …”</w:t>
+      </w:r>
+      <w:r>
+        <w:t xml:space="preserve">.</w:t>
       </w:r>
     </w:p>
     <w:tbl>
@@ -711,18 +898,18 @@
                 <wp:inline>
                   <wp:extent cx="152400" cy="152400"/>
                   <wp:effectExtent b="0" l="0" r="0" t="0"/>
-                  <wp:docPr descr="" title="" id="17" name="Picture"/>
+                  <wp:docPr descr="" title="" id="20" name="Picture"/>
                   <a:graphic>
                     <a:graphicData uri="http://schemas.openxmlformats.org/drawingml/2006/picture">
                       <pic:pic>
                         <pic:nvPicPr>
-                          <pic:cNvPr descr="/opt/quarto/share/formats/docx/note.png" id="18" name="Picture"/>
+                          <pic:cNvPr descr="/opt/quarto/share/formats/docx/note.png" id="21" name="Picture"/>
                           <pic:cNvPicPr>
                             <a:picLocks noChangeArrowheads="1" noChangeAspect="1"/>
                           </pic:cNvPicPr>
                         </pic:nvPicPr>
                         <pic:blipFill>
-                          <a:blip r:embed="rId16"/>
+                          <a:blip r:embed="rId19"/>
                           <a:stretch>
                             <a:fillRect/>
                           </a:stretch>
@@ -779,12 +966,18 @@
               <w:spacing w:before="16" w:after="16"/>
             </w:pPr>
             <w:r>
-              <w:t xml:space="preserve">Adapted from the</w:t>
+              <w:t xml:space="preserve">The sections on slide decks, presentation resources and scientific figures</w:t>
             </w:r>
             <w:r>
               <w:t xml:space="preserve"> </w:t>
             </w:r>
-            <w:hyperlink r:id="rId19">
+            <w:r>
+              <w:t xml:space="preserve">are adapted from the</w:t>
+            </w:r>
+            <w:r>
+              <w:t xml:space="preserve"> </w:t>
+            </w:r>
+            <w:hyperlink r:id="rId22">
               <w:r>
                 <w:rPr>
                   <w:rStyle w:val="Hyperlink"/>
@@ -801,7 +994,7 @@
             <w:r>
               <w:t xml:space="preserve"> </w:t>
             </w:r>
-            <w:hyperlink r:id="rId20">
+            <w:hyperlink r:id="rId23">
               <w:r>
                 <w:rPr>
                   <w:rStyle w:val="Hyperlink"/>
@@ -830,7 +1023,7 @@
             <w:r>
               <w:t xml:space="preserve"> </w:t>
             </w:r>
-            <w:hyperlink r:id="rId21">
+            <w:hyperlink r:id="rId24">
               <w:r>
                 <w:rPr>
                   <w:rStyle w:val="Hyperlink"/>
@@ -844,13 +1037,19 @@
             <w:r>
               <w:t xml:space="preserve">by Jade Benjamin-Chung.</w:t>
             </w:r>
+            <w:r>
+              <w:t xml:space="preserve"> </w:t>
+            </w:r>
+            <w:r>
+              <w:t xml:space="preserve">The section on three-dimensional graphs is original to this guide.</w:t>
+            </w:r>
           </w:p>
           <w:p/>
         </w:tc>
       </w:tr>
     </w:tbl>
-    <w:bookmarkStart w:id="28" w:name="refs"/>
-    <w:bookmarkStart w:id="23" w:name="ref-kirchoff2021"/>
+    <w:bookmarkStart w:id="31" w:name="refs"/>
+    <w:bookmarkStart w:id="26" w:name="ref-kirchoff2021"/>
     <w:p>
       <w:pPr>
         <w:pStyle w:val="Bibliography"/>
@@ -883,7 +1082,7 @@
       <w:r>
         <w:t xml:space="preserve"> </w:t>
       </w:r>
-      <w:hyperlink r:id="rId22">
+      <w:hyperlink r:id="rId25">
         <w:r>
           <w:rPr>
             <w:rStyle w:val="Hyperlink"/>
@@ -895,8 +1094,8 @@
         <w:t xml:space="preserve">.</w:t>
       </w:r>
     </w:p>
-    <w:bookmarkEnd w:id="23"/>
-    <w:bookmarkStart w:id="25" w:name="ref-ratcliff2023"/>
+    <w:bookmarkEnd w:id="26"/>
+    <w:bookmarkStart w:id="28" w:name="ref-ratcliff2023"/>
     <w:p>
       <w:pPr>
         <w:pStyle w:val="Bibliography"/>
@@ -941,7 +1140,7 @@
       <w:r>
         <w:t xml:space="preserve"> </w:t>
       </w:r>
-      <w:hyperlink r:id="rId24">
+      <w:hyperlink r:id="rId27">
         <w:r>
           <w:rPr>
             <w:rStyle w:val="Hyperlink"/>
@@ -953,8 +1152,8 @@
         <w:t xml:space="preserve">.</w:t>
       </w:r>
     </w:p>
-    <w:bookmarkEnd w:id="25"/>
-    <w:bookmarkStart w:id="27" w:name="ref-rougier2014"/>
+    <w:bookmarkEnd w:id="28"/>
+    <w:bookmarkStart w:id="30" w:name="ref-rougier2014"/>
     <w:p>
       <w:pPr>
         <w:pStyle w:val="Bibliography"/>
@@ -987,7 +1186,7 @@
       <w:r>
         <w:t xml:space="preserve"> </w:t>
       </w:r>
-      <w:hyperlink r:id="rId26">
+      <w:hyperlink r:id="rId29">
         <w:r>
           <w:rPr>
             <w:rStyle w:val="Hyperlink"/>
@@ -999,9 +1198,9 @@
         <w:t xml:space="preserve">.</w:t>
       </w:r>
     </w:p>
-    <w:bookmarkEnd w:id="27"/>
-    <w:bookmarkEnd w:id="28"/>
-    <w:bookmarkEnd w:id="29"/>
+    <w:bookmarkEnd w:id="30"/>
+    <w:bookmarkEnd w:id="31"/>
+    <w:bookmarkEnd w:id="32"/>
     <w:sectPr>
       <w:footnotePr>
         <w:numRestart w:val="eachSect"/>
@@ -1228,6 +1427,9 @@
     <w:abstractNumId w:val="991"/>
   </w:num>
   <w:num w:numId="1004">
+    <w:abstractNumId w:val="991"/>
+  </w:num>
+  <w:num w:numId="1005">
     <w:abstractNumId w:val="991"/>
   </w:num>
 </w:numbering>

</xml_diff>

<commit_message>
Deploying to gh-pages from @ Morrison-Lab/psw@ff900793a76496827db25db0eeca885a351ca1bb 🚀
</commit_message>
<xml_diff>
--- a/chapters/slides-posters-figures.docx
+++ b/chapters/slides-posters-figures.docx
@@ -15,7 +15,7 @@
         <w:pStyle w:val="Date"/>
       </w:pPr>
       <w:r>
-        <w:t xml:space="preserve">Last modified: 2026-10-14 03:09:08 (PDT)</w:t>
+        <w:t xml:space="preserve">Last modified: 2026-10-14 08:02:01 (PDT)</w:t>
       </w:r>
     </w:p>
     <w:p>
@@ -402,7 +402,7 @@
       </w:r>
     </w:p>
     <w:bookmarkEnd w:id="12"/>
-    <w:bookmarkStart w:id="16" w:name="sec-scientific-figures"/>
+    <w:bookmarkStart w:id="17" w:name="sec-scientific-figures"/>
     <w:p>
       <w:pPr>
         <w:pStyle w:val="Heading2"/>
@@ -414,6 +414,79 @@
     <w:p>
       <w:pPr>
         <w:pStyle w:val="FirstParagraph"/>
+      </w:pPr>
+      <w:r>
+        <w:t xml:space="preserve">Include a figure wherever one helps a reader see a definition, an example, or a result.</w:t>
+      </w:r>
+      <w:r>
+        <w:t xml:space="preserve"> </w:t>
+      </w:r>
+      <w:r>
+        <w:t xml:space="preserve">Draw a graph for a relationship between quantities, a diagram for a structure or a process,</w:t>
+      </w:r>
+      <w:r>
+        <w:t xml:space="preserve"> </w:t>
+      </w:r>
+      <w:r>
+        <w:t xml:space="preserve">and a plot of the data for a fitted model or an estimate.</w:t>
+      </w:r>
+      <w:r>
+        <w:t xml:space="preserve"> </w:t>
+      </w:r>
+      <w:r>
+        <w:t xml:space="preserve">Add figures to new work as you write it, and add them to existing chapters that lack them.</w:t>
+      </w:r>
+      <w:r>
+        <w:t xml:space="preserve"> </w:t>
+      </w:r>
+      <w:r>
+        <w:t xml:space="preserve">On a website or slide deck, draw a graph as an interactive</w:t>
+      </w:r>
+      <w:r>
+        <w:t xml:space="preserve"> </w:t>
+      </w:r>
+      <w:hyperlink r:id="rId13">
+        <w:r>
+          <w:rPr>
+            <w:rStyle w:val="Hyperlink"/>
+          </w:rPr>
+          <w:t xml:space="preserve">plotly</w:t>
+        </w:r>
+      </w:hyperlink>
+      <w:r>
+        <w:t xml:space="preserve"> </w:t>
+      </w:r>
+      <w:r>
+        <w:t xml:space="preserve">figure where feasible,</w:t>
+      </w:r>
+      <w:r>
+        <w:t xml:space="preserve"> </w:t>
+      </w:r>
+      <w:r>
+        <w:t xml:space="preserve">and as a 3D plotly figure where a third dimension shows the idea,</w:t>
+      </w:r>
+      <w:r>
+        <w:t xml:space="preserve"> </w:t>
+      </w:r>
+      <w:r>
+        <w:t xml:space="preserve">such as a surface over two parameters.</w:t>
+      </w:r>
+      <w:r>
+        <w:t xml:space="preserve"> </w:t>
+      </w:r>
+      <w:r>
+        <w:t xml:space="preserve">Keep a static image for the PDF and Word outputs, which cannot show a widget.</w:t>
+      </w:r>
+      <w:r>
+        <w:t xml:space="preserve"> </w:t>
+      </w:r>
+      <w:r>
+        <w:t xml:space="preserve">Give every figure alt text, a numbered caption, and a code chunk that comments what the code does and why.</w:t>
+      </w:r>
+    </w:p>
+    <w:p>
+      <w:pPr>
+        <w:pStyle w:val="BodyText"/>
       </w:pPr>
       <w:r>
         <w:t xml:space="preserve">A clear figure lets a reader check a result without help from the text.</w:t>
@@ -532,7 +605,7 @@
       <w:r>
         <w:t xml:space="preserve"> </w:t>
       </w:r>
-      <w:hyperlink r:id="rId13">
+      <w:hyperlink r:id="rId14">
         <w:r>
           <w:rPr>
             <w:rStyle w:val="Hyperlink"/>
@@ -549,7 +622,7 @@
       <w:r>
         <w:t xml:space="preserve"> </w:t>
       </w:r>
-      <w:hyperlink r:id="rId14">
+      <w:hyperlink r:id="rId15">
         <w:r>
           <w:rPr>
             <w:rStyle w:val="Hyperlink"/>
@@ -643,7 +716,7 @@
           <w:numId w:val="1004"/>
         </w:numPr>
       </w:pPr>
-      <w:hyperlink r:id="rId15">
+      <w:hyperlink r:id="rId16">
         <w:r>
           <w:rPr>
             <w:rStyle w:val="Hyperlink"/>
@@ -670,8 +743,8 @@
         <w:t xml:space="preserve">with sidenotes, typography, and tight integration of graphics with text</w:t>
       </w:r>
     </w:p>
-    <w:bookmarkEnd w:id="16"/>
-    <w:bookmarkStart w:id="32" w:name="sec-3d-graphs"/>
+    <w:bookmarkEnd w:id="17"/>
+    <w:bookmarkStart w:id="33" w:name="sec-3d-graphs"/>
     <w:p>
       <w:pPr>
         <w:pStyle w:val="Heading2"/>
@@ -792,7 +865,7 @@
       <w:r>
         <w:t xml:space="preserve"> </w:t>
       </w:r>
-      <w:hyperlink r:id="rId17">
+      <w:hyperlink r:id="rId18">
         <w:r>
           <w:rPr>
             <w:rStyle w:val="Hyperlink"/>
@@ -824,7 +897,7 @@
       <w:r>
         <w:t xml:space="preserve"> </w:t>
       </w:r>
-      <w:hyperlink r:id="rId18">
+      <w:hyperlink r:id="rId19">
         <w:r>
           <w:rPr>
             <w:rStyle w:val="Hyperlink"/>
@@ -898,18 +971,18 @@
                 <wp:inline>
                   <wp:extent cx="152400" cy="152400"/>
                   <wp:effectExtent b="0" l="0" r="0" t="0"/>
-                  <wp:docPr descr="" title="" id="20" name="Picture"/>
+                  <wp:docPr descr="" title="" id="21" name="Picture"/>
                   <a:graphic>
                     <a:graphicData uri="http://schemas.openxmlformats.org/drawingml/2006/picture">
                       <pic:pic>
                         <pic:nvPicPr>
-                          <pic:cNvPr descr="/opt/quarto/share/formats/docx/note.png" id="21" name="Picture"/>
+                          <pic:cNvPr descr="/opt/quarto/share/formats/docx/note.png" id="22" name="Picture"/>
                           <pic:cNvPicPr>
                             <a:picLocks noChangeArrowheads="1" noChangeAspect="1"/>
                           </pic:cNvPicPr>
                         </pic:nvPicPr>
                         <pic:blipFill>
-                          <a:blip r:embed="rId19"/>
+                          <a:blip r:embed="rId20"/>
                           <a:stretch>
                             <a:fillRect/>
                           </a:stretch>
@@ -977,7 +1050,7 @@
             <w:r>
               <w:t xml:space="preserve"> </w:t>
             </w:r>
-            <w:hyperlink r:id="rId22">
+            <w:hyperlink r:id="rId23">
               <w:r>
                 <w:rPr>
                   <w:rStyle w:val="Hyperlink"/>
@@ -994,7 +1067,7 @@
             <w:r>
               <w:t xml:space="preserve"> </w:t>
             </w:r>
-            <w:hyperlink r:id="rId23">
+            <w:hyperlink r:id="rId24">
               <w:r>
                 <w:rPr>
                   <w:rStyle w:val="Hyperlink"/>
@@ -1023,7 +1096,7 @@
             <w:r>
               <w:t xml:space="preserve"> </w:t>
             </w:r>
-            <w:hyperlink r:id="rId24">
+            <w:hyperlink r:id="rId25">
               <w:r>
                 <w:rPr>
                   <w:rStyle w:val="Hyperlink"/>
@@ -1048,8 +1121,8 @@
         </w:tc>
       </w:tr>
     </w:tbl>
-    <w:bookmarkStart w:id="31" w:name="refs"/>
-    <w:bookmarkStart w:id="26" w:name="ref-kirchoff2021"/>
+    <w:bookmarkStart w:id="32" w:name="refs"/>
+    <w:bookmarkStart w:id="27" w:name="ref-kirchoff2021"/>
     <w:p>
       <w:pPr>
         <w:pStyle w:val="Bibliography"/>
@@ -1082,7 +1155,7 @@
       <w:r>
         <w:t xml:space="preserve"> </w:t>
       </w:r>
-      <w:hyperlink r:id="rId25">
+      <w:hyperlink r:id="rId26">
         <w:r>
           <w:rPr>
             <w:rStyle w:val="Hyperlink"/>
@@ -1094,8 +1167,8 @@
         <w:t xml:space="preserve">.</w:t>
       </w:r>
     </w:p>
-    <w:bookmarkEnd w:id="26"/>
-    <w:bookmarkStart w:id="28" w:name="ref-ratcliff2023"/>
+    <w:bookmarkEnd w:id="27"/>
+    <w:bookmarkStart w:id="29" w:name="ref-ratcliff2023"/>
     <w:p>
       <w:pPr>
         <w:pStyle w:val="Bibliography"/>
@@ -1140,7 +1213,7 @@
       <w:r>
         <w:t xml:space="preserve"> </w:t>
       </w:r>
-      <w:hyperlink r:id="rId27">
+      <w:hyperlink r:id="rId28">
         <w:r>
           <w:rPr>
             <w:rStyle w:val="Hyperlink"/>
@@ -1152,8 +1225,8 @@
         <w:t xml:space="preserve">.</w:t>
       </w:r>
     </w:p>
-    <w:bookmarkEnd w:id="28"/>
-    <w:bookmarkStart w:id="30" w:name="ref-rougier2014"/>
+    <w:bookmarkEnd w:id="29"/>
+    <w:bookmarkStart w:id="31" w:name="ref-rougier2014"/>
     <w:p>
       <w:pPr>
         <w:pStyle w:val="Bibliography"/>
@@ -1186,7 +1259,7 @@
       <w:r>
         <w:t xml:space="preserve"> </w:t>
       </w:r>
-      <w:hyperlink r:id="rId29">
+      <w:hyperlink r:id="rId30">
         <w:r>
           <w:rPr>
             <w:rStyle w:val="Hyperlink"/>
@@ -1198,9 +1271,9 @@
         <w:t xml:space="preserve">.</w:t>
       </w:r>
     </w:p>
-    <w:bookmarkEnd w:id="30"/>
     <w:bookmarkEnd w:id="31"/>
     <w:bookmarkEnd w:id="32"/>
+    <w:bookmarkEnd w:id="33"/>
     <w:sectPr>
       <w:footnotePr>
         <w:numRestart w:val="eachSect"/>

</xml_diff>

<commit_message>
Deploying to gh-pages from @ Morrison-Lab/psw@a7f450933b6d57f652f182822325455f17c32928 🚀
</commit_message>
<xml_diff>
--- a/chapters/slides-posters-figures.docx
+++ b/chapters/slides-posters-figures.docx
@@ -15,7 +15,7 @@
         <w:pStyle w:val="Date"/>
       </w:pPr>
       <w:r>
-        <w:t xml:space="preserve">Last modified: 2026-10-15 00:56:17 (PDT)</w:t>
+        <w:t xml:space="preserve">Last modified: 2026-10-15 12:42:12 (PDT)</w:t>
       </w:r>
     </w:p>
     <w:p>
@@ -532,6 +532,48 @@
       </w:pPr>
       <w:r>
         <w:t xml:space="preserve">Include enough tick marks and tick labels.</w:t>
+      </w:r>
+    </w:p>
+    <w:p>
+      <w:pPr>
+        <w:pStyle w:val="Compact"/>
+        <w:numPr>
+          <w:ilvl w:val="0"/>
+          <w:numId w:val="1003"/>
+        </w:numPr>
+      </w:pPr>
+      <w:r>
+        <w:t xml:space="preserve">Put the ticks in the original measurement scale of each variable,</w:t>
+      </w:r>
+      <w:r>
+        <w:t xml:space="preserve"> </w:t>
+      </w:r>
+      <w:r>
+        <w:t xml:space="preserve">however the model is parametrized and the axis is spaced.</w:t>
+      </w:r>
+      <w:r>
+        <w:t xml:space="preserve"> </w:t>
+      </w:r>
+      <w:r>
+        <w:t xml:space="preserve">If a fit uses scaled or standardized values,</w:t>
+      </w:r>
+      <w:r>
+        <w:t xml:space="preserve"> </w:t>
+      </w:r>
+      <w:r>
+        <w:t xml:space="preserve">place the ticks at round original values and label them with those,</w:t>
+      </w:r>
+      <w:r>
+        <w:t xml:space="preserve"> </w:t>
+      </w:r>
+      <w:r>
+        <w:t xml:space="preserve">so a horsepower axis reads 50, 100, 150 and 200, not 0 to 1.</w:t>
+      </w:r>
+      <w:r>
+        <w:t xml:space="preserve"> </w:t>
+      </w:r>
+      <w:r>
+        <w:t xml:space="preserve">Report numbers such as an error in the response’s units too.</w:t>
       </w:r>
     </w:p>
     <w:p>

</xml_diff>

<commit_message>
Deploying to gh-pages from @ Morrison-Lab/psw@1289f9746c62f13f021fe31310041883efb92139 🚀
</commit_message>
<xml_diff>
--- a/chapters/slides-posters-figures.docx
+++ b/chapters/slides-posters-figures.docx
@@ -15,7 +15,7 @@
         <w:pStyle w:val="Date"/>
       </w:pPr>
       <w:r>
-        <w:t xml:space="preserve">Last modified: 2026-10-15 21:21:35 (PDT)</w:t>
+        <w:t xml:space="preserve">Last modified: 2026-10-15 22:06:09 (PDT)</w:t>
       </w:r>
     </w:p>
     <w:p>
@@ -246,6 +246,68 @@
       </w:r>
       <w:r>
         <w:t xml:space="preserve">Use clean charts, diagrams, and annotated figures instead of text-heavy bullet lists.</w:t>
+      </w:r>
+    </w:p>
+    <w:p>
+      <w:pPr>
+        <w:pStyle w:val="Compact"/>
+        <w:numPr>
+          <w:ilvl w:val="0"/>
+          <w:numId w:val="1001"/>
+        </w:numPr>
+      </w:pPr>
+      <w:r>
+        <w:rPr>
+          <w:b/>
+          <w:bCs/>
+        </w:rPr>
+        <w:t xml:space="preserve">Direct attention</w:t>
+      </w:r>
+      <w:r>
+        <w:t xml:space="preserve">:</w:t>
+      </w:r>
+      <w:r>
+        <w:t xml:space="preserve"> </w:t>
+      </w:r>
+      <w:r>
+        <w:t xml:space="preserve">Use callouts, annotations, or a sequential reveal</w:t>
+      </w:r>
+      <w:r>
+        <w:t xml:space="preserve"> </w:t>
+      </w:r>
+      <w:r>
+        <w:t xml:space="preserve">so the audience looks at the part of the figure you are discussing.</w:t>
+      </w:r>
+    </w:p>
+    <w:p>
+      <w:pPr>
+        <w:pStyle w:val="Compact"/>
+        <w:numPr>
+          <w:ilvl w:val="0"/>
+          <w:numId w:val="1001"/>
+        </w:numPr>
+      </w:pPr>
+      <w:r>
+        <w:rPr>
+          <w:b/>
+          <w:bCs/>
+        </w:rPr>
+        <w:t xml:space="preserve">Show software working</w:t>
+      </w:r>
+      <w:r>
+        <w:t xml:space="preserve">:</w:t>
+      </w:r>
+      <w:r>
+        <w:t xml:space="preserve"> </w:t>
+      </w:r>
+      <w:r>
+        <w:t xml:space="preserve">When you present a package or a pipeline, show live output, reproducible code, or a screenshot</w:t>
+      </w:r>
+      <w:r>
+        <w:t xml:space="preserve"> </w:t>
+      </w:r>
+      <w:r>
+        <w:t xml:space="preserve">instead of only listing its features.</w:t>
       </w:r>
     </w:p>
     <w:p>
@@ -489,6 +551,50 @@
         <w:pStyle w:val="BodyText"/>
       </w:pPr>
       <w:r>
+        <w:t xml:space="preserve">Lead with a well-labeled figure or table</w:t>
+      </w:r>
+      <w:r>
+        <w:t xml:space="preserve"> </w:t>
+      </w:r>
+      <w:r>
+        <w:t xml:space="preserve">instead of a long paragraph that describes a pipeline or compares groups.</w:t>
+      </w:r>
+      <w:r>
+        <w:t xml:space="preserve"> </w:t>
+      </w:r>
+      <w:r>
+        <w:t xml:space="preserve">Use a diagram for a conceptual model, such as a directed acyclic graph (DAG),</w:t>
+      </w:r>
+      <w:r>
+        <w:t xml:space="preserve"> </w:t>
+      </w:r>
+      <w:r>
+        <w:t xml:space="preserve">and for a process, such as a participant flow (CONSORT) diagram or a workflow schematic.</w:t>
+      </w:r>
+      <w:r>
+        <w:t xml:space="preserve"> </w:t>
+      </w:r>
+      <w:r>
+        <w:t xml:space="preserve">Let the text interpret what the figure shows</w:t>
+      </w:r>
+      <w:r>
+        <w:t xml:space="preserve"> </w:t>
+      </w:r>
+      <w:r>
+        <w:t xml:space="preserve">instead of listing every number the reader can already see in it.</w:t>
+      </w:r>
+      <w:r>
+        <w:t xml:space="preserve"> </w:t>
+      </w:r>
+      <w:r>
+        <w:t xml:space="preserve">Give the key estimates in the text and point to the figure for the rest.</w:t>
+      </w:r>
+    </w:p>
+    <w:p>
+      <w:pPr>
+        <w:pStyle w:val="BodyText"/>
+      </w:pPr>
+      <w:r>
         <w:t xml:space="preserve">A clear figure lets a reader check a result without help from the text.</w:t>
       </w:r>
       <w:r>
@@ -786,7 +892,7 @@
       </w:r>
     </w:p>
     <w:bookmarkEnd w:id="17"/>
-    <w:bookmarkStart w:id="33" w:name="sec-3d-graphs"/>
+    <w:bookmarkStart w:id="34" w:name="sec-3d-graphs"/>
     <w:p>
       <w:pPr>
         <w:pStyle w:val="Heading2"/>
@@ -1156,6 +1262,35 @@
               <w:t xml:space="preserve"> </w:t>
             </w:r>
             <w:r>
+              <w:t xml:space="preserve">The guidance on leading with figures, drawing diagrams, directing attention, and showing software</w:t>
+            </w:r>
+            <w:r>
+              <w:t xml:space="preserve"> </w:t>
+            </w:r>
+            <w:r>
+              <w:t xml:space="preserve">is adapted from the</w:t>
+            </w:r>
+            <w:r>
+              <w:t xml:space="preserve"> </w:t>
+            </w:r>
+            <w:hyperlink r:id="rId26">
+              <w:r>
+                <w:rPr>
+                  <w:rStyle w:val="Hyperlink"/>
+                </w:rPr>
+                <w:t xml:space="preserve">Writing</w:t>
+              </w:r>
+            </w:hyperlink>
+            <w:r>
+              <w:t xml:space="preserve"> </w:t>
+            </w:r>
+            <w:r>
+              <w:t xml:space="preserve">chapter of the UCD-SERG lab manual.</w:t>
+            </w:r>
+            <w:r>
+              <w:t xml:space="preserve"> </w:t>
+            </w:r>
+            <w:r>
               <w:t xml:space="preserve">The section on three-dimensional graphs is original to this guide.</w:t>
             </w:r>
           </w:p>
@@ -1163,8 +1298,8 @@
         </w:tc>
       </w:tr>
     </w:tbl>
-    <w:bookmarkStart w:id="32" w:name="refs"/>
-    <w:bookmarkStart w:id="27" w:name="ref-kirchoff2021"/>
+    <w:bookmarkStart w:id="33" w:name="refs"/>
+    <w:bookmarkStart w:id="28" w:name="ref-kirchoff2021"/>
     <w:p>
       <w:pPr>
         <w:pStyle w:val="Bibliography"/>
@@ -1197,7 +1332,7 @@
       <w:r>
         <w:t xml:space="preserve"> </w:t>
       </w:r>
-      <w:hyperlink r:id="rId26">
+      <w:hyperlink r:id="rId27">
         <w:r>
           <w:rPr>
             <w:rStyle w:val="Hyperlink"/>
@@ -1209,8 +1344,8 @@
         <w:t xml:space="preserve">.</w:t>
       </w:r>
     </w:p>
-    <w:bookmarkEnd w:id="27"/>
-    <w:bookmarkStart w:id="29" w:name="ref-ratcliff2023"/>
+    <w:bookmarkEnd w:id="28"/>
+    <w:bookmarkStart w:id="30" w:name="ref-ratcliff2023"/>
     <w:p>
       <w:pPr>
         <w:pStyle w:val="Bibliography"/>
@@ -1255,7 +1390,7 @@
       <w:r>
         <w:t xml:space="preserve"> </w:t>
       </w:r>
-      <w:hyperlink r:id="rId28">
+      <w:hyperlink r:id="rId29">
         <w:r>
           <w:rPr>
             <w:rStyle w:val="Hyperlink"/>
@@ -1267,8 +1402,8 @@
         <w:t xml:space="preserve">.</w:t>
       </w:r>
     </w:p>
-    <w:bookmarkEnd w:id="29"/>
-    <w:bookmarkStart w:id="31" w:name="ref-rougier2014"/>
+    <w:bookmarkEnd w:id="30"/>
+    <w:bookmarkStart w:id="32" w:name="ref-rougier2014"/>
     <w:p>
       <w:pPr>
         <w:pStyle w:val="Bibliography"/>
@@ -1301,7 +1436,7 @@
       <w:r>
         <w:t xml:space="preserve"> </w:t>
       </w:r>
-      <w:hyperlink r:id="rId30">
+      <w:hyperlink r:id="rId31">
         <w:r>
           <w:rPr>
             <w:rStyle w:val="Hyperlink"/>
@@ -1313,9 +1448,9 @@
         <w:t xml:space="preserve">.</w:t>
       </w:r>
     </w:p>
-    <w:bookmarkEnd w:id="31"/>
     <w:bookmarkEnd w:id="32"/>
     <w:bookmarkEnd w:id="33"/>
+    <w:bookmarkEnd w:id="34"/>
     <w:sectPr>
       <w:footnotePr>
         <w:numRestart w:val="eachSect"/>

</xml_diff>

<commit_message>
Deploying to gh-pages from @ Morrison-Lab/psw@e4536d820d9b5131cdea45084ec2ca322a24d46d 🚀
</commit_message>
<xml_diff>
--- a/chapters/slides-posters-figures.docx
+++ b/chapters/slides-posters-figures.docx
@@ -15,7 +15,7 @@
         <w:pStyle w:val="Date"/>
       </w:pPr>
       <w:r>
-        <w:t xml:space="preserve">Last modified: 2026-10-15 23:26:10 (PDT)</w:t>
+        <w:t xml:space="preserve">Last modified: 2026-10-15 23:42:45 (PDT)</w:t>
       </w:r>
     </w:p>
     <w:p>
@@ -892,7 +892,7 @@
       </w:r>
     </w:p>
     <w:bookmarkEnd w:id="17"/>
-    <w:bookmarkStart w:id="34" w:name="sec-3d-graphs"/>
+    <w:bookmarkStart w:id="33" w:name="sec-3d-graphs"/>
     <w:p>
       <w:pPr>
         <w:pStyle w:val="Heading2"/>
@@ -1262,35 +1262,6 @@
               <w:t xml:space="preserve"> </w:t>
             </w:r>
             <w:r>
-              <w:t xml:space="preserve">The guidance on leading with figures, drawing diagrams, directing attention, and showing software</w:t>
-            </w:r>
-            <w:r>
-              <w:t xml:space="preserve"> </w:t>
-            </w:r>
-            <w:r>
-              <w:t xml:space="preserve">is adapted from the</w:t>
-            </w:r>
-            <w:r>
-              <w:t xml:space="preserve"> </w:t>
-            </w:r>
-            <w:hyperlink r:id="rId26">
-              <w:r>
-                <w:rPr>
-                  <w:rStyle w:val="Hyperlink"/>
-                </w:rPr>
-                <w:t xml:space="preserve">Writing</w:t>
-              </w:r>
-            </w:hyperlink>
-            <w:r>
-              <w:t xml:space="preserve"> </w:t>
-            </w:r>
-            <w:r>
-              <w:t xml:space="preserve">chapter of the UCD-SERG lab manual.</w:t>
-            </w:r>
-            <w:r>
-              <w:t xml:space="preserve"> </w:t>
-            </w:r>
-            <w:r>
               <w:t xml:space="preserve">The section on three-dimensional graphs is original to this guide.</w:t>
             </w:r>
           </w:p>
@@ -1298,8 +1269,8 @@
         </w:tc>
       </w:tr>
     </w:tbl>
-    <w:bookmarkStart w:id="33" w:name="refs"/>
-    <w:bookmarkStart w:id="28" w:name="ref-kirchoff2021"/>
+    <w:bookmarkStart w:id="32" w:name="refs"/>
+    <w:bookmarkStart w:id="27" w:name="ref-kirchoff2021"/>
     <w:p>
       <w:pPr>
         <w:pStyle w:val="Bibliography"/>
@@ -1332,7 +1303,7 @@
       <w:r>
         <w:t xml:space="preserve"> </w:t>
       </w:r>
-      <w:hyperlink r:id="rId27">
+      <w:hyperlink r:id="rId26">
         <w:r>
           <w:rPr>
             <w:rStyle w:val="Hyperlink"/>
@@ -1344,8 +1315,8 @@
         <w:t xml:space="preserve">.</w:t>
       </w:r>
     </w:p>
-    <w:bookmarkEnd w:id="28"/>
-    <w:bookmarkStart w:id="30" w:name="ref-ratcliff2023"/>
+    <w:bookmarkEnd w:id="27"/>
+    <w:bookmarkStart w:id="29" w:name="ref-ratcliff2023"/>
     <w:p>
       <w:pPr>
         <w:pStyle w:val="Bibliography"/>
@@ -1390,7 +1361,7 @@
       <w:r>
         <w:t xml:space="preserve"> </w:t>
       </w:r>
-      <w:hyperlink r:id="rId29">
+      <w:hyperlink r:id="rId28">
         <w:r>
           <w:rPr>
             <w:rStyle w:val="Hyperlink"/>
@@ -1402,8 +1373,8 @@
         <w:t xml:space="preserve">.</w:t>
       </w:r>
     </w:p>
-    <w:bookmarkEnd w:id="30"/>
-    <w:bookmarkStart w:id="32" w:name="ref-rougier2014"/>
+    <w:bookmarkEnd w:id="29"/>
+    <w:bookmarkStart w:id="31" w:name="ref-rougier2014"/>
     <w:p>
       <w:pPr>
         <w:pStyle w:val="Bibliography"/>
@@ -1436,7 +1407,7 @@
       <w:r>
         <w:t xml:space="preserve"> </w:t>
       </w:r>
-      <w:hyperlink r:id="rId31">
+      <w:hyperlink r:id="rId30">
         <w:r>
           <w:rPr>
             <w:rStyle w:val="Hyperlink"/>
@@ -1448,9 +1419,9 @@
         <w:t xml:space="preserve">.</w:t>
       </w:r>
     </w:p>
+    <w:bookmarkEnd w:id="31"/>
     <w:bookmarkEnd w:id="32"/>
     <w:bookmarkEnd w:id="33"/>
-    <w:bookmarkEnd w:id="34"/>
     <w:sectPr>
       <w:footnotePr>
         <w:numRestart w:val="eachSect"/>

</xml_diff>

<commit_message>
Deploying to gh-pages from @ Morrison-Lab/psw@f9ec53a92a5e742ea404b6f004e55394ee49e880 🚀
</commit_message>
<xml_diff>
--- a/chapters/slides-posters-figures.docx
+++ b/chapters/slides-posters-figures.docx
@@ -15,7 +15,7 @@
         <w:pStyle w:val="Date"/>
       </w:pPr>
       <w:r>
-        <w:t xml:space="preserve">Last modified: 2026-10-22 15:35:41 (PDT)</w:t>
+        <w:t xml:space="preserve">Last modified: 2026-10-22 16:04:26 (PDT)</w:t>
       </w:r>
     </w:p>
     <w:p>
@@ -1079,6 +1079,30 @@
       </w:hyperlink>
       <w:r>
         <w:t xml:space="preserve">).</w:t>
+      </w:r>
+      <w:r>
+        <w:t xml:space="preserve"> </w:t>
+      </w:r>
+      <w:r>
+        <w:t xml:space="preserve">Pair color with shape or line type,</w:t>
+      </w:r>
+      <w:r>
+        <w:t xml:space="preserve"> </w:t>
+      </w:r>
+      <w:r>
+        <w:t xml:space="preserve">so that color is never the only way to tell groups apart.</w:t>
+      </w:r>
+      <w:r>
+        <w:t xml:space="preserve"> </w:t>
+      </w:r>
+      <w:r>
+        <w:t xml:space="preserve">This matters most with more than 3 or 4 groups,</w:t>
+      </w:r>
+      <w:r>
+        <w:t xml:space="preserve"> </w:t>
+      </w:r>
+      <w:r>
+        <w:t xml:space="preserve">because even a colorblind-friendly palette then has pairs of colors that are close together.</w:t>
       </w:r>
     </w:p>
     <w:p>

</xml_diff>

<commit_message>
Deploying to gh-pages from @ Morrison-Lab/psw@e2e7adeacf4dcd805706f32d3fd2a5f31099594e 🚀
</commit_message>
<xml_diff>
--- a/chapters/slides-posters-figures.docx
+++ b/chapters/slides-posters-figures.docx
@@ -15,7 +15,7 @@
         <w:pStyle w:val="Date"/>
       </w:pPr>
       <w:r>
-        <w:t xml:space="preserve">Last modified: 2026-10-26 01:33:48 (PDT)</w:t>
+        <w:t xml:space="preserve">Last modified: 2026-10-26 01:48:18 (PDT)</w:t>
       </w:r>
     </w:p>
     <w:p>
@@ -850,6 +850,161 @@
         <w:pStyle w:val="BodyText"/>
       </w:pPr>
       <w:r>
+        <w:t xml:space="preserve">Open each caption with a sentence that says what the figure or table shows,</w:t>
+      </w:r>
+      <w:r>
+        <w:t xml:space="preserve"> </w:t>
+      </w:r>
+      <w:r>
+        <w:t xml:space="preserve">so a reader who sees only the figure or table learns its point without following a link.</w:t>
+      </w:r>
+      <w:r>
+        <w:t xml:space="preserve"> </w:t>
+      </w:r>
+      <w:r>
+        <w:t xml:space="preserve">A cross-reference to the example or section that the figure or table illustrates may support that sentence,</w:t>
+      </w:r>
+      <w:r>
+        <w:t xml:space="preserve"> </w:t>
+      </w:r>
+      <w:r>
+        <w:t xml:space="preserve">either after the sentence or in parentheses within the sentence,</w:t>
+      </w:r>
+      <w:r>
+        <w:t xml:space="preserve"> </w:t>
+      </w:r>
+      <w:r>
+        <w:t xml:space="preserve">but the cross-reference never replaces the sentence.</w:t>
+      </w:r>
+      <w:r>
+        <w:t xml:space="preserve"> </w:t>
+      </w:r>
+      <w:r>
+        <w:t xml:space="preserve">Two captions for the same figure show the difference:</w:t>
+      </w:r>
+    </w:p>
+    <w:p>
+      <w:pPr>
+        <w:pStyle w:val="Compact"/>
+        <w:numPr>
+          <w:ilvl w:val="0"/>
+          <w:numId w:val="1004"/>
+        </w:numPr>
+      </w:pPr>
+      <w:r>
+        <w:t xml:space="preserve">Pointer only:</w:t>
+      </w:r>
+      <w:r>
+        <w:t xml:space="preserve"> </w:t>
+      </w:r>
+      <w:r>
+        <w:t xml:space="preserve">“The symmetry of</w:t>
+      </w:r>
+      <w:r>
+        <w:t xml:space="preserve"> </w:t>
+      </w:r>
+      <w:r>
+        <w:rPr>
+          <w:rStyle w:val="VerbatimChar"/>
+        </w:rPr>
+        <w:t xml:space="preserve">@exm-x</w:t>
+      </w:r>
+      <w:r>
+        <w:t xml:space="preserve">.”</w:t>
+      </w:r>
+      <w:r>
+        <w:t xml:space="preserve"> </w:t>
+      </w:r>
+      <w:r>
+        <w:t xml:space="preserve">The reader learns nothing until following the link.</w:t>
+      </w:r>
+    </w:p>
+    <w:p>
+      <w:pPr>
+        <w:pStyle w:val="Compact"/>
+        <w:numPr>
+          <w:ilvl w:val="0"/>
+          <w:numId w:val="1004"/>
+        </w:numPr>
+      </w:pPr>
+      <w:r>
+        <w:t xml:space="preserve">Self-contained:</w:t>
+      </w:r>
+      <w:r>
+        <w:t xml:space="preserve"> </w:t>
+      </w:r>
+      <w:r>
+        <w:t xml:space="preserve">“The logistic function at</w:t>
+      </w:r>
+      <w:r>
+        <w:t xml:space="preserve"> </w:t>
+      </w:r>
+      <m:oMath>
+        <m:r>
+          <m:rPr>
+            <m:sty m:val="p"/>
+          </m:rPr>
+          <m:t>−</m:t>
+        </m:r>
+        <m:r>
+          <m:t>2</m:t>
+        </m:r>
+      </m:oMath>
+      <w:r>
+        <w:t xml:space="preserve"> </w:t>
+      </w:r>
+      <w:r>
+        <w:t xml:space="preserve">is as high as</w:t>
+      </w:r>
+      <w:r>
+        <w:t xml:space="preserve"> </w:t>
+      </w:r>
+      <m:oMath>
+        <m:r>
+          <m:t>1</m:t>
+        </m:r>
+      </m:oMath>
+      <w:r>
+        <w:t xml:space="preserve"> </w:t>
+      </w:r>
+      <w:r>
+        <w:t xml:space="preserve">minus its value at</w:t>
+      </w:r>
+      <w:r>
+        <w:t xml:space="preserve"> </w:t>
+      </w:r>
+      <m:oMath>
+        <m:r>
+          <m:t>2</m:t>
+        </m:r>
+      </m:oMath>
+      <w:r>
+        <w:t xml:space="preserve"> </w:t>
+      </w:r>
+      <w:r>
+        <w:t xml:space="preserve">(</w:t>
+      </w:r>
+      <w:r>
+        <w:rPr>
+          <w:rStyle w:val="VerbatimChar"/>
+        </w:rPr>
+        <w:t xml:space="preserve">@exm-x</w:t>
+      </w:r>
+      <w:r>
+        <w:t xml:space="preserve">).”</w:t>
+      </w:r>
+      <w:r>
+        <w:t xml:space="preserve"> </w:t>
+      </w:r>
+      <w:r>
+        <w:t xml:space="preserve">The reader learns the point at once.</w:t>
+      </w:r>
+    </w:p>
+    <w:p>
+      <w:pPr>
+        <w:pStyle w:val="FirstParagraph"/>
+      </w:pPr>
+      <w:r>
         <w:t xml:space="preserve">Lead with a well-labeled figure or table</w:t>
       </w:r>
       <w:r>
@@ -908,7 +1063,7 @@
         <w:pStyle w:val="Compact"/>
         <w:numPr>
           <w:ilvl w:val="0"/>
-          <w:numId w:val="1004"/>
+          <w:numId w:val="1005"/>
         </w:numPr>
       </w:pPr>
       <w:r>
@@ -920,7 +1075,7 @@
         <w:pStyle w:val="Compact"/>
         <w:numPr>
           <w:ilvl w:val="0"/>
-          <w:numId w:val="1004"/>
+          <w:numId w:val="1005"/>
         </w:numPr>
       </w:pPr>
       <w:r>
@@ -932,7 +1087,7 @@
         <w:pStyle w:val="Compact"/>
         <w:numPr>
           <w:ilvl w:val="0"/>
-          <w:numId w:val="1004"/>
+          <w:numId w:val="1005"/>
         </w:numPr>
       </w:pPr>
       <w:r>
@@ -944,7 +1099,7 @@
         <w:pStyle w:val="Compact"/>
         <w:numPr>
           <w:ilvl w:val="0"/>
-          <w:numId w:val="1004"/>
+          <w:numId w:val="1005"/>
         </w:numPr>
       </w:pPr>
       <w:r>
@@ -986,7 +1141,7 @@
         <w:pStyle w:val="Compact"/>
         <w:numPr>
           <w:ilvl w:val="0"/>
-          <w:numId w:val="1004"/>
+          <w:numId w:val="1005"/>
         </w:numPr>
       </w:pPr>
       <w:r>
@@ -1025,7 +1180,7 @@
         <w:pStyle w:val="Compact"/>
         <w:numPr>
           <w:ilvl w:val="0"/>
-          <w:numId w:val="1004"/>
+          <w:numId w:val="1005"/>
         </w:numPr>
       </w:pPr>
       <w:r>
@@ -1037,7 +1192,7 @@
         <w:pStyle w:val="Compact"/>
         <w:numPr>
           <w:ilvl w:val="0"/>
-          <w:numId w:val="1004"/>
+          <w:numId w:val="1005"/>
         </w:numPr>
       </w:pPr>
       <w:r>
@@ -1110,7 +1265,7 @@
         <w:pStyle w:val="Compact"/>
         <w:numPr>
           <w:ilvl w:val="0"/>
-          <w:numId w:val="1004"/>
+          <w:numId w:val="1005"/>
         </w:numPr>
       </w:pPr>
       <w:r>
@@ -1122,7 +1277,7 @@
         <w:pStyle w:val="Compact"/>
         <w:numPr>
           <w:ilvl w:val="0"/>
-          <w:numId w:val="1004"/>
+          <w:numId w:val="1005"/>
         </w:numPr>
       </w:pPr>
       <w:r>
@@ -1140,7 +1295,7 @@
         <w:pStyle w:val="Compact"/>
         <w:numPr>
           <w:ilvl w:val="0"/>
-          <w:numId w:val="1004"/>
+          <w:numId w:val="1005"/>
         </w:numPr>
       </w:pPr>
       <w:r>
@@ -1203,7 +1358,7 @@
         <w:pStyle w:val="Compact"/>
         <w:numPr>
           <w:ilvl w:val="0"/>
-          <w:numId w:val="1004"/>
+          <w:numId w:val="1005"/>
         </w:numPr>
       </w:pPr>
       <w:r>
@@ -1215,7 +1370,7 @@
         <w:pStyle w:val="Compact"/>
         <w:numPr>
           <w:ilvl w:val="0"/>
-          <w:numId w:val="1004"/>
+          <w:numId w:val="1005"/>
         </w:numPr>
       </w:pPr>
       <w:r>
@@ -1227,7 +1382,7 @@
         <w:pStyle w:val="Compact"/>
         <w:numPr>
           <w:ilvl w:val="0"/>
-          <w:numId w:val="1004"/>
+          <w:numId w:val="1005"/>
         </w:numPr>
       </w:pPr>
       <w:r>
@@ -1247,7 +1402,7 @@
         <w:pStyle w:val="Compact"/>
         <w:numPr>
           <w:ilvl w:val="0"/>
-          <w:numId w:val="1005"/>
+          <w:numId w:val="1006"/>
         </w:numPr>
       </w:pPr>
       <w:r>
@@ -1265,7 +1420,7 @@
         <w:pStyle w:val="Compact"/>
         <w:numPr>
           <w:ilvl w:val="0"/>
-          <w:numId w:val="1005"/>
+          <w:numId w:val="1006"/>
         </w:numPr>
       </w:pPr>
       <w:hyperlink r:id="rId22">
@@ -1354,7 +1509,7 @@
         <w:pStyle w:val="Compact"/>
         <w:numPr>
           <w:ilvl w:val="0"/>
-          <w:numId w:val="1006"/>
+          <w:numId w:val="1007"/>
         </w:numPr>
       </w:pPr>
       <w:r>
@@ -1372,7 +1527,7 @@
         <w:pStyle w:val="Compact"/>
         <w:numPr>
           <w:ilvl w:val="0"/>
-          <w:numId w:val="1006"/>
+          <w:numId w:val="1007"/>
         </w:numPr>
       </w:pPr>
       <w:r>
@@ -1390,7 +1545,7 @@
         <w:pStyle w:val="Compact"/>
         <w:numPr>
           <w:ilvl w:val="0"/>
-          <w:numId w:val="1006"/>
+          <w:numId w:val="1007"/>
         </w:numPr>
       </w:pPr>
       <w:r>
@@ -1408,7 +1563,7 @@
         <w:pStyle w:val="Compact"/>
         <w:numPr>
           <w:ilvl w:val="0"/>
-          <w:numId w:val="1006"/>
+          <w:numId w:val="1007"/>
         </w:numPr>
       </w:pPr>
       <w:r>
@@ -1466,7 +1621,7 @@
         <w:pStyle w:val="Compact"/>
         <w:numPr>
           <w:ilvl w:val="0"/>
-          <w:numId w:val="1006"/>
+          <w:numId w:val="1007"/>
         </w:numPr>
       </w:pPr>
       <w:r>
@@ -2100,6 +2255,9 @@
     <w:abstractNumId w:val="991"/>
   </w:num>
   <w:num w:numId="1006">
+    <w:abstractNumId w:val="991"/>
+  </w:num>
+  <w:num w:numId="1007">
     <w:abstractNumId w:val="991"/>
   </w:num>
 </w:numbering>

</xml_diff>

<commit_message>
Deploying to gh-pages from @ Morrison-Lab/psw@a178e5776bebd8b71a0a5d9576ffe6b0ccbd0b61 🚀
</commit_message>
<xml_diff>
--- a/chapters/slides-posters-figures.docx
+++ b/chapters/slides-posters-figures.docx
@@ -15,7 +15,7 @@
         <w:pStyle w:val="Date"/>
       </w:pPr>
       <w:r>
-        <w:t xml:space="preserve">Last modified: 2026-10-26 13:43:45 (PDT)</w:t>
+        <w:t xml:space="preserve">Last modified: 2026-10-26 14:13:25 (PDT)</w:t>
       </w:r>
     </w:p>
     <w:p>
@@ -763,7 +763,7 @@
     </w:p>
     <w:bookmarkEnd w:id="15"/>
     <w:bookmarkEnd w:id="16"/>
-    <w:bookmarkStart w:id="23" w:name="sec-scientific-figures"/>
+    <w:bookmarkStart w:id="24" w:name="sec-scientific-figures"/>
     <w:p>
       <w:pPr>
         <w:pStyle w:val="Heading2"/>
@@ -1362,6 +1362,152 @@
         </w:numPr>
       </w:pPr>
       <w:r>
+        <w:t xml:space="preserve">Draw a tree (a parse tree, decision tree, dendrogram, or any other hierarchy) as a diagram figure,</w:t>
+      </w:r>
+      <w:r>
+        <w:t xml:space="preserve"> </w:t>
+      </w:r>
+      <w:r>
+        <w:t xml:space="preserve">not only as nested bullets.</w:t>
+      </w:r>
+      <w:r>
+        <w:t xml:space="preserve"> </w:t>
+      </w:r>
+      <w:r>
+        <w:t xml:space="preserve">A nested list hides how the branches relate and makes a reader count indentation to find a node’s parent.</w:t>
+      </w:r>
+      <w:r>
+        <w:t xml:space="preserve"> </w:t>
+      </w:r>
+      <w:r>
+        <w:t xml:space="preserve">Keep the list too when it adds information the diagram lacks.</w:t>
+      </w:r>
+      <w:r>
+        <w:t xml:space="preserve"> </w:t>
+      </w:r>
+      <w:r>
+        <w:t xml:space="preserve">Draw the diagram from the tree’s data and fill leaves and internal nodes differently,</w:t>
+      </w:r>
+      <w:r>
+        <w:t xml:space="preserve"> </w:t>
+      </w:r>
+      <w:r>
+        <w:t xml:space="preserve">with the legend at the bottom.</w:t>
+      </w:r>
+      <w:r>
+        <w:t xml:space="preserve"> </w:t>
+      </w:r>
+      <w:r>
+        <w:t xml:space="preserve">Wrap the diagram in a</w:t>
+      </w:r>
+      <w:r>
+        <w:t xml:space="preserve"> </w:t>
+      </w:r>
+      <w:r>
+        <w:rPr>
+          <w:rStyle w:val="VerbatimChar"/>
+        </w:rPr>
+        <w:t xml:space="preserve">#fig-</w:t>
+      </w:r>
+      <w:r>
+        <w:t xml:space="preserve"> </w:t>
+      </w:r>
+      <w:r>
+        <w:t xml:space="preserve">div with a caption, and set alt text that reads out the structure with</w:t>
+      </w:r>
+      <w:r>
+        <w:t xml:space="preserve"> </w:t>
+      </w:r>
+      <w:r>
+        <w:rPr>
+          <w:rStyle w:val="VerbatimChar"/>
+        </w:rPr>
+        <w:t xml:space="preserve">fig-alt</w:t>
+      </w:r>
+      <w:r>
+        <w:t xml:space="preserve">.</w:t>
+      </w:r>
+      <w:r>
+        <w:t xml:space="preserve"> </w:t>
+      </w:r>
+      <w:r>
+        <w:t xml:space="preserve">The</w:t>
+      </w:r>
+      <w:r>
+        <w:t xml:space="preserve"> </w:t>
+      </w:r>
+      <w:hyperlink r:id="rId22">
+        <w:r>
+          <w:rPr>
+            <w:rStyle w:val="Hyperlink"/>
+          </w:rPr>
+          <w:t xml:space="preserve">Morrison-Lab/gha</w:t>
+        </w:r>
+      </w:hyperlink>
+      <w:r>
+        <w:t xml:space="preserve"> </w:t>
+      </w:r>
+      <w:r>
+        <w:t xml:space="preserve">check</w:t>
+      </w:r>
+      <w:r>
+        <w:t xml:space="preserve"> </w:t>
+      </w:r>
+      <w:r>
+        <w:rPr>
+          <w:rStyle w:val="VerbatimChar"/>
+        </w:rPr>
+        <w:t xml:space="preserve">check-tree-lists</w:t>
+      </w:r>
+      <w:r>
+        <w:t xml:space="preserve"> </w:t>
+      </w:r>
+      <w:r>
+        <w:t xml:space="preserve">flags a pull request that adds</w:t>
+      </w:r>
+      <w:r>
+        <w:t xml:space="preserve"> </w:t>
+      </w:r>
+      <w:r>
+        <w:t xml:space="preserve">a definition, example, or other labeled div that mentions a tree, holds a list nested three or more levels deep,</w:t>
+      </w:r>
+      <w:r>
+        <w:t xml:space="preserve"> </w:t>
+      </w:r>
+      <w:r>
+        <w:t xml:space="preserve">and has no figure;</w:t>
+      </w:r>
+      <w:r>
+        <w:t xml:space="preserve"> </w:t>
+      </w:r>
+      <w:r>
+        <w:t xml:space="preserve">a</w:t>
+      </w:r>
+      <w:r>
+        <w:t xml:space="preserve"> </w:t>
+      </w:r>
+      <w:r>
+        <w:rPr>
+          <w:rStyle w:val="VerbatimChar"/>
+        </w:rPr>
+        <w:t xml:space="preserve">&lt;!-- no-tree-figure: reason --&gt;</w:t>
+      </w:r>
+      <w:r>
+        <w:t xml:space="preserve"> </w:t>
+      </w:r>
+      <w:r>
+        <w:t xml:space="preserve">comment inside the div exempts it.</w:t>
+      </w:r>
+    </w:p>
+    <w:p>
+      <w:pPr>
+        <w:pStyle w:val="Compact"/>
+        <w:numPr>
+          <w:ilvl w:val="0"/>
+          <w:numId w:val="1005"/>
+        </w:numPr>
+      </w:pPr>
+      <w:r>
         <w:t xml:space="preserve">Minimize abbreviations in labels and legends.</w:t>
       </w:r>
     </w:p>
@@ -1423,7 +1569,7 @@
           <w:numId w:val="1006"/>
         </w:numPr>
       </w:pPr>
-      <w:hyperlink r:id="rId22">
+      <w:hyperlink r:id="rId23">
         <w:r>
           <w:rPr>
             <w:rStyle w:val="Hyperlink"/>
@@ -1450,8 +1596,8 @@
         <w:t xml:space="preserve">with sidenotes, typography, and tight integration of graphics with text</w:t>
       </w:r>
     </w:p>
-    <w:bookmarkEnd w:id="23"/>
-    <w:bookmarkStart w:id="41" w:name="sec-3d-graphs"/>
+    <w:bookmarkEnd w:id="24"/>
+    <w:bookmarkStart w:id="42" w:name="sec-3d-graphs"/>
     <w:p>
       <w:pPr>
         <w:pStyle w:val="Heading2"/>
@@ -1572,7 +1718,7 @@
       <w:r>
         <w:t xml:space="preserve"> </w:t>
       </w:r>
-      <w:hyperlink r:id="rId24">
+      <w:hyperlink r:id="rId25">
         <w:r>
           <w:rPr>
             <w:rStyle w:val="Hyperlink"/>
@@ -1604,7 +1750,7 @@
       <w:r>
         <w:t xml:space="preserve"> </w:t>
       </w:r>
-      <w:hyperlink r:id="rId25">
+      <w:hyperlink r:id="rId26">
         <w:r>
           <w:rPr>
             <w:rStyle w:val="Hyperlink"/>
@@ -1678,18 +1824,18 @@
                 <wp:inline>
                   <wp:extent cx="152400" cy="152400"/>
                   <wp:effectExtent b="0" l="0" r="0" t="0"/>
-                  <wp:docPr descr="" title="" id="27" name="Picture"/>
+                  <wp:docPr descr="" title="" id="28" name="Picture"/>
                   <a:graphic>
                     <a:graphicData uri="http://schemas.openxmlformats.org/drawingml/2006/picture">
                       <pic:pic>
                         <pic:nvPicPr>
-                          <pic:cNvPr descr="/opt/quarto/share/formats/docx/note.png" id="28" name="Picture"/>
+                          <pic:cNvPr descr="/opt/quarto/share/formats/docx/note.png" id="29" name="Picture"/>
                           <pic:cNvPicPr>
                             <a:picLocks noChangeArrowheads="1" noChangeAspect="1"/>
                           </pic:cNvPicPr>
                         </pic:nvPicPr>
                         <pic:blipFill>
-                          <a:blip r:embed="rId26"/>
+                          <a:blip r:embed="rId27"/>
                           <a:stretch>
                             <a:fillRect/>
                           </a:stretch>
@@ -1751,7 +1897,7 @@
             <w:r>
               <w:t xml:space="preserve"> </w:t>
             </w:r>
-            <w:hyperlink r:id="rId29">
+            <w:hyperlink r:id="rId30">
               <w:r>
                 <w:rPr>
                   <w:rStyle w:val="Hyperlink"/>
@@ -1786,7 +1932,7 @@
       <w:r>
         <w:t xml:space="preserve"> </w:t>
       </w:r>
-      <w:hyperlink r:id="rId30">
+      <w:hyperlink r:id="rId31">
         <w:r>
           <w:rPr>
             <w:rStyle w:val="Hyperlink"/>
@@ -1803,7 +1949,7 @@
       <w:r>
         <w:t xml:space="preserve"> </w:t>
       </w:r>
-      <w:hyperlink r:id="rId31">
+      <w:hyperlink r:id="rId32">
         <w:r>
           <w:rPr>
             <w:rStyle w:val="Hyperlink"/>
@@ -1824,8 +1970,8 @@
         <w:t xml:space="preserve">of the UCD-SERG lab manual.</w:t>
       </w:r>
     </w:p>
-    <w:bookmarkStart w:id="40" w:name="refs"/>
-    <w:bookmarkStart w:id="33" w:name="ref-anscombe1973"/>
+    <w:bookmarkStart w:id="41" w:name="refs"/>
+    <w:bookmarkStart w:id="34" w:name="ref-anscombe1973"/>
     <w:p>
       <w:pPr>
         <w:pStyle w:val="Bibliography"/>
@@ -1858,7 +2004,7 @@
       <w:r>
         <w:t xml:space="preserve"> </w:t>
       </w:r>
-      <w:hyperlink r:id="rId32">
+      <w:hyperlink r:id="rId33">
         <w:r>
           <w:rPr>
             <w:rStyle w:val="Hyperlink"/>
@@ -1870,8 +2016,8 @@
         <w:t xml:space="preserve">.</w:t>
       </w:r>
     </w:p>
-    <w:bookmarkEnd w:id="33"/>
-    <w:bookmarkStart w:id="35" w:name="ref-kirchoff2021"/>
+    <w:bookmarkEnd w:id="34"/>
+    <w:bookmarkStart w:id="36" w:name="ref-kirchoff2021"/>
     <w:p>
       <w:pPr>
         <w:pStyle w:val="Bibliography"/>
@@ -1904,7 +2050,7 @@
       <w:r>
         <w:t xml:space="preserve"> </w:t>
       </w:r>
-      <w:hyperlink r:id="rId34">
+      <w:hyperlink r:id="rId35">
         <w:r>
           <w:rPr>
             <w:rStyle w:val="Hyperlink"/>
@@ -1916,8 +2062,8 @@
         <w:t xml:space="preserve">.</w:t>
       </w:r>
     </w:p>
-    <w:bookmarkEnd w:id="35"/>
-    <w:bookmarkStart w:id="37" w:name="ref-ratcliff2023"/>
+    <w:bookmarkEnd w:id="36"/>
+    <w:bookmarkStart w:id="38" w:name="ref-ratcliff2023"/>
     <w:p>
       <w:pPr>
         <w:pStyle w:val="Bibliography"/>
@@ -1962,7 +2108,7 @@
       <w:r>
         <w:t xml:space="preserve"> </w:t>
       </w:r>
-      <w:hyperlink r:id="rId36">
+      <w:hyperlink r:id="rId37">
         <w:r>
           <w:rPr>
             <w:rStyle w:val="Hyperlink"/>
@@ -1974,8 +2120,8 @@
         <w:t xml:space="preserve">.</w:t>
       </w:r>
     </w:p>
-    <w:bookmarkEnd w:id="37"/>
-    <w:bookmarkStart w:id="39" w:name="ref-rougier2014"/>
+    <w:bookmarkEnd w:id="38"/>
+    <w:bookmarkStart w:id="40" w:name="ref-rougier2014"/>
     <w:p>
       <w:pPr>
         <w:pStyle w:val="Bibliography"/>
@@ -2008,7 +2154,7 @@
       <w:r>
         <w:t xml:space="preserve"> </w:t>
       </w:r>
-      <w:hyperlink r:id="rId38">
+      <w:hyperlink r:id="rId39">
         <w:r>
           <w:rPr>
             <w:rStyle w:val="Hyperlink"/>
@@ -2020,9 +2166,9 @@
         <w:t xml:space="preserve">.</w:t>
       </w:r>
     </w:p>
-    <w:bookmarkEnd w:id="39"/>
     <w:bookmarkEnd w:id="40"/>
     <w:bookmarkEnd w:id="41"/>
+    <w:bookmarkEnd w:id="42"/>
     <w:sectPr>
       <w:footnotePr>
         <w:numRestart w:val="eachSect"/>

</xml_diff>

<commit_message>
Deploying to gh-pages from @ Morrison-Lab/psw@1e5f8f886bb298cd4421fdd390af0264acc8f6d9 🚀
</commit_message>
<xml_diff>
--- a/chapters/slides-posters-figures.docx
+++ b/chapters/slides-posters-figures.docx
@@ -15,7 +15,7 @@
         <w:pStyle w:val="Date"/>
       </w:pPr>
       <w:r>
-        <w:t xml:space="preserve">Last modified: 2026-10-27 20:51:01 (PDT)</w:t>
+        <w:t xml:space="preserve">Last modified: 2026-10-27 20:57:47 (PDT)</w:t>
       </w:r>
     </w:p>
     <w:p>
@@ -1068,6 +1068,126 @@
       </w:pPr>
       <w:r>
         <w:t xml:space="preserve">Label the x-axis and y-axis clearly.</w:t>
+      </w:r>
+      <w:r>
+        <w:t xml:space="preserve"> </w:t>
+      </w:r>
+      <w:r>
+        <w:t xml:space="preserve">Name each quantity in plain words, and add its symbol only as an option:</w:t>
+      </w:r>
+      <w:r>
+        <w:t xml:space="preserve"> </w:t>
+      </w:r>
+      <w:r>
+        <w:t xml:space="preserve">“Probability,</w:t>
+      </w:r>
+      <w:r>
+        <w:t xml:space="preserve"> </w:t>
+      </w:r>
+      <w:r>
+        <w:t xml:space="preserve">$\prob$</w:t>
+      </w:r>
+      <w:r>
+        <w:t xml:space="preserve">”</w:t>
+      </w:r>
+      <w:r>
+        <w:t xml:space="preserve"> </w:t>
+      </w:r>
+      <w:r>
+        <w:t xml:space="preserve">and</w:t>
+      </w:r>
+      <w:r>
+        <w:t xml:space="preserve"> </w:t>
+      </w:r>
+      <w:r>
+        <w:t xml:space="preserve">“Log-odds,</w:t>
+      </w:r>
+      <w:r>
+        <w:t xml:space="preserve"> </w:t>
+      </w:r>
+      <w:r>
+        <w:t xml:space="preserve">$\logodds$</w:t>
+      </w:r>
+      <w:r>
+        <w:t xml:space="preserve">”</w:t>
+      </w:r>
+      <w:r>
+        <w:t xml:space="preserve">,</w:t>
+      </w:r>
+      <w:r>
+        <w:t xml:space="preserve"> </w:t>
+      </w:r>
+      <w:r>
+        <w:t xml:space="preserve">not</w:t>
+      </w:r>
+      <w:r>
+        <w:t xml:space="preserve"> </w:t>
+      </w:r>
+      <w:r>
+        <w:t xml:space="preserve">“</w:t>
+      </w:r>
+      <w:r>
+        <w:t xml:space="preserve">$\prob$</w:t>
+      </w:r>
+      <w:r>
+        <w:t xml:space="preserve">”</w:t>
+      </w:r>
+      <w:r>
+        <w:t xml:space="preserve"> </w:t>
+      </w:r>
+      <w:r>
+        <w:t xml:space="preserve">or</w:t>
+      </w:r>
+      <w:r>
+        <w:t xml:space="preserve"> </w:t>
+      </w:r>
+      <w:r>
+        <w:t xml:space="preserve">“</w:t>
+      </w:r>
+      <w:r>
+        <w:t xml:space="preserve">$\logodds$</w:t>
+      </w:r>
+      <w:r>
+        <w:t xml:space="preserve">”</w:t>
+      </w:r>
+      <w:r>
+        <w:t xml:space="preserve"> </w:t>
+      </w:r>
+      <w:r>
+        <w:t xml:space="preserve">alone,</w:t>
+      </w:r>
+      <w:r>
+        <w:t xml:space="preserve"> </w:t>
+      </w:r>
+      <w:r>
+        <w:t xml:space="preserve">and not</w:t>
+      </w:r>
+      <w:r>
+        <w:t xml:space="preserve"> </w:t>
+      </w:r>
+      <w:r>
+        <w:t xml:space="preserve">“f(x)”</w:t>
+      </w:r>
+      <w:r>
+        <w:t xml:space="preserve"> </w:t>
+      </w:r>
+      <w:r>
+        <w:t xml:space="preserve">or</w:t>
+      </w:r>
+      <w:r>
+        <w:t xml:space="preserve"> </w:t>
+      </w:r>
+      <w:r>
+        <w:t xml:space="preserve">“x1”</w:t>
+      </w:r>
+      <w:r>
+        <w:t xml:space="preserve">.</w:t>
+      </w:r>
+      <w:r>
+        <w:t xml:space="preserve"> </w:t>
+      </w:r>
+      <w:r>
+        <w:t xml:space="preserve">A reader should not have to look up a symbol to know what an axis shows.</w:t>
       </w:r>
     </w:p>
     <w:p>

</xml_diff>

<commit_message>
Deploying to gh-pages from @ Morrison-Lab/psw@024a8cb1cf3cc9edb59b5f274d2221ca1fc6376c 🚀
</commit_message>
<xml_diff>
--- a/chapters/slides-posters-figures.docx
+++ b/chapters/slides-posters-figures.docx
@@ -15,7 +15,7 @@
         <w:pStyle w:val="Date"/>
       </w:pPr>
       <w:r>
-        <w:t xml:space="preserve">Last modified: 2026-10-28 15:53:04 (PDT)</w:t>
+        <w:t xml:space="preserve">Last modified: 2026-10-28 16:02:11 (PDT)</w:t>
       </w:r>
     </w:p>
     <w:p>
@@ -1199,6 +1199,24 @@
       </w:r>
       <w:r>
         <w:t xml:space="preserve">A reader should not have to look up a symbol to know what an axis shows.</w:t>
+      </w:r>
+      <w:r>
+        <w:t xml:space="preserve"> </w:t>
+      </w:r>
+      <w:r>
+        <w:t xml:space="preserve">Wrap a long y-axis title onto two lines</w:t>
+      </w:r>
+      <w:r>
+        <w:t xml:space="preserve"> </w:t>
+      </w:r>
+      <w:r>
+        <w:t xml:space="preserve">so that it stays horizontal and readable,</w:t>
+      </w:r>
+      <w:r>
+        <w:t xml:space="preserve"> </w:t>
+      </w:r>
+      <w:r>
+        <w:t xml:space="preserve">rather than rotating it or shortening it to a symbol.</w:t>
       </w:r>
     </w:p>
     <w:p>

</xml_diff>